<commit_message>
Add DLKcat head-to-head on identical splits (GNN+CNN reimplementation)
- scripts/11_dlkcat_headtohead.py: faithful PyTorch reimplementation of the
  DLKcat architecture (molecular-graph GNN + amino-acid n-gram CNN), trained on
  the same 17,051 records and the same random/enzyme-group splits as 07.
  Result: r=0.466 (random), r=0.356 (group); the gap to CarotKcat (0.727/0.440)
  isolates the contribution of the pretrained ESM-2 representation.
- benchmark_table.csv / fig_benchmark.png: 7 models x 2 protocols.
- Manuscript: Table 1 now includes the DLKcat-style row plus DLKcat's published
  metrics as a footnoted reference (different split, no runnable weights);
  section 3.2, abstract, discussion and Fig. 3 legend updated accordingly.
- app.py / start_webui.bat: force localhost to bypass system HTTP proxy, fixing
  the Gradio startup-events 502 error.
</commit_message>
<xml_diff>
--- a/manuscript/CarotKcat_manuscript_v2.docx
+++ b/manuscript/CarotKcat_manuscript_v2.docx
@@ -82,7 +82,7 @@
           <w:rFonts w:ascii="Times New Roman" w:hAnsi="Times New Roman" w:eastAsia="SimSun"/>
           <w:sz w:val="22"/>
         </w:rPr>
-        <w:t xml:space="preserve"> We present CarotKcat, a dual-tower deep learning model that predicts kcat directly from enzyme amino-acid sequence (ESM-2 650M embeddings) and substrate structure (molecular fingerprints). Trained on 17,051 curated records covering 2,164 substrates and ~2,700 enzymes integrated from BRENDA and SABIO-RK, CarotKcat achieves Pearson r = 0.727 / R² = 0.528 under random splitting and Pearson r = 0.440 / R² = 0.189 under a stricter enzyme-group split, outperforming tree-based reimplementations of UniKP- and TurNuP-style baselines on unseen enzymes. In a held-out literature case study of 11 carotenoid-pathway enzymes absent from training, CarotKcat reproduced the pathway-level rate-limiting hierarchy (CrtB &gt; CrtE &gt; CrtI; Spearman ρ = 0.60), matched the measured kcat of yeast GGPP synthase within 1.4-fold, and correctly predicted the substrate preference of β-carotene hydroxylase CrtZ. We additionally provide proteome-scale kcat predictions for 3,725 carotenoid-related enzymes and a zero-installation web interface for experimentalists.</w:t>
+        <w:t xml:space="preserve"> We present CarotKcat, a dual-tower deep learning model that predicts kcat directly from enzyme amino-acid sequence (ESM-2 650M embeddings) and substrate structure (molecular fingerprints). Trained on 17,051 curated records covering 2,164 substrates and ~2,700 enzymes integrated from BRENDA and SABIO-RK, CarotKcat achieves Pearson r = 0.727 / R² = 0.528 under random splitting and Pearson r = 0.440 / R² = 0.189 under a stricter enzyme-group split, outperforming tree-based reimplementations of UniKP- and TurNuP-style baselines, as well as a from-scratch reimplementation of the DLKcat GNN+CNN architecture, on unseen enzymes. In a held-out literature case study of 11 carotenoid-pathway enzymes absent from training, CarotKcat reproduced the pathway-level rate-limiting hierarchy (CrtB &gt; CrtE &gt; CrtI; Spearman ρ = 0.60), matched the measured kcat of yeast GGPP synthase within 1.4-fold, and correctly predicted the substrate preference of β-carotene hydroxylase CrtZ. We additionally provide proteome-scale kcat predictions for 3,725 carotenoid-related enzymes and a zero-installation web interface for experimentalists.</w:t>
       </w:r>
     </w:p>
     <w:p>
@@ -768,7 +768,7 @@
           <w:rFonts w:ascii="Times New Roman" w:hAnsi="Times New Roman" w:eastAsia="SimSun"/>
           <w:sz w:val="22"/>
         </w:rPr>
-        <w:t xml:space="preserve"> Benchmark of CarotKcat against reimplemented literature-style baselines and ablations (test-set Pearson r / R²).</w:t>
+        <w:t xml:space="preserve"> Benchmark of CarotKcat against reimplemented literature-style baselines, a from-scratch DLKcat-architecture reimplementation, and single-modality ablations (test-set Pearson r / R²).</w:t>
       </w:r>
     </w:p>
     <w:tbl>
@@ -1262,6 +1262,95 @@
                 <w:rFonts w:ascii="Times New Roman" w:hAnsi="Times New Roman" w:eastAsia="SimSun"/>
                 <w:sz w:val="18"/>
               </w:rPr>
+              <w:t>DLKcat-style (GNN+CNN, reimplemented)</w:t>
+            </w:r>
+          </w:p>
+        </w:tc>
+        <w:tc>
+          <w:tcPr>
+            <w:tcW w:type="dxa" w:w="3022"/>
+            <w:tcBorders>
+              <w:top w:val="nil"/>
+              <w:bottom w:val="nil"/>
+              <w:left w:val="nil"/>
+              <w:right w:val="nil"/>
+            </w:tcBorders>
+          </w:tcPr>
+          <w:p>
+            <w:pPr>
+              <w:jc w:val="center"/>
+            </w:pPr>
+            <w:r>
+              <w:rPr>
+                <w:rFonts w:ascii="Times New Roman" w:hAnsi="Times New Roman" w:eastAsia="SimSun"/>
+                <w:sz w:val="18"/>
+              </w:rPr>
+            </w:r>
+            <w:r>
+              <w:rPr>
+                <w:rFonts w:ascii="Times New Roman" w:hAnsi="Times New Roman" w:eastAsia="SimSun"/>
+                <w:sz w:val="18"/>
+              </w:rPr>
+              <w:t>0.466 / 0.208</w:t>
+            </w:r>
+          </w:p>
+        </w:tc>
+        <w:tc>
+          <w:tcPr>
+            <w:tcW w:type="dxa" w:w="3022"/>
+            <w:tcBorders>
+              <w:top w:val="nil"/>
+              <w:bottom w:val="nil"/>
+              <w:left w:val="nil"/>
+              <w:right w:val="nil"/>
+            </w:tcBorders>
+          </w:tcPr>
+          <w:p>
+            <w:pPr>
+              <w:jc w:val="center"/>
+            </w:pPr>
+            <w:r>
+              <w:rPr>
+                <w:rFonts w:ascii="Times New Roman" w:hAnsi="Times New Roman" w:eastAsia="SimSun"/>
+                <w:sz w:val="18"/>
+              </w:rPr>
+            </w:r>
+            <w:r>
+              <w:rPr>
+                <w:rFonts w:ascii="Times New Roman" w:hAnsi="Times New Roman" w:eastAsia="SimSun"/>
+                <w:sz w:val="18"/>
+              </w:rPr>
+              <w:t>0.356 / 0.108</w:t>
+            </w:r>
+          </w:p>
+        </w:tc>
+      </w:tr>
+      <w:tr>
+        <w:tc>
+          <w:tcPr>
+            <w:tcW w:type="dxa" w:w="3022"/>
+            <w:tcBorders>
+              <w:top w:val="nil"/>
+              <w:bottom w:val="nil"/>
+              <w:left w:val="nil"/>
+              <w:right w:val="nil"/>
+            </w:tcBorders>
+          </w:tcPr>
+          <w:p>
+            <w:pPr>
+              <w:jc w:val="left"/>
+            </w:pPr>
+            <w:r>
+              <w:rPr>
+                <w:rFonts w:ascii="Times New Roman" w:hAnsi="Times New Roman" w:eastAsia="SimSun"/>
+                <w:sz w:val="18"/>
+              </w:rPr>
+            </w:r>
+            <w:r>
+              <w:rPr>
+                <w:rFonts w:ascii="Times New Roman" w:hAnsi="Times New Roman" w:eastAsia="SimSun"/>
+                <w:sz w:val="18"/>
+              </w:rPr>
               <w:t>Sequence only (ESM + MLP)</w:t>
             </w:r>
           </w:p>
@@ -1331,7 +1420,7 @@
             <w:tcW w:type="dxa" w:w="3022"/>
             <w:tcBorders>
               <w:top w:val="nil"/>
-              <w:bottom w:val="single" w:sz="12" w:color="000000"/>
+              <w:bottom w:val="nil"/>
               <w:left w:val="nil"/>
               <w:right w:val="nil"/>
             </w:tcBorders>
@@ -1360,7 +1449,7 @@
             <w:tcW w:type="dxa" w:w="3022"/>
             <w:tcBorders>
               <w:top w:val="nil"/>
-              <w:bottom w:val="single" w:sz="12" w:color="000000"/>
+              <w:bottom w:val="nil"/>
               <w:left w:val="nil"/>
               <w:right w:val="nil"/>
             </w:tcBorders>
@@ -1389,7 +1478,7 @@
             <w:tcW w:type="dxa" w:w="3022"/>
             <w:tcBorders>
               <w:top w:val="nil"/>
-              <w:bottom w:val="single" w:sz="12" w:color="000000"/>
+              <w:bottom w:val="nil"/>
               <w:left w:val="nil"/>
               <w:right w:val="nil"/>
             </w:tcBorders>
@@ -1414,7 +1503,109 @@
           </w:p>
         </w:tc>
       </w:tr>
+      <w:tr>
+        <w:tc>
+          <w:tcPr>
+            <w:tcW w:type="dxa" w:w="3022"/>
+            <w:tcBorders>
+              <w:top w:val="nil"/>
+              <w:bottom w:val="single" w:sz="12" w:color="000000"/>
+              <w:left w:val="nil"/>
+              <w:right w:val="nil"/>
+            </w:tcBorders>
+          </w:tcPr>
+          <w:p>
+            <w:pPr>
+              <w:jc w:val="left"/>
+            </w:pPr>
+            <w:r>
+              <w:rPr>
+                <w:rFonts w:ascii="Times New Roman" w:hAnsi="Times New Roman" w:eastAsia="SimSun"/>
+                <w:sz w:val="18"/>
+              </w:rPr>
+            </w:r>
+            <w:r>
+              <w:rPr>
+                <w:rFonts w:ascii="Times New Roman" w:hAnsi="Times New Roman" w:eastAsia="SimSun"/>
+                <w:sz w:val="18"/>
+              </w:rPr>
+              <w:t>DLKcat original (published)†</w:t>
+            </w:r>
+          </w:p>
+        </w:tc>
+        <w:tc>
+          <w:tcPr>
+            <w:tcW w:type="dxa" w:w="3022"/>
+            <w:tcBorders>
+              <w:top w:val="nil"/>
+              <w:bottom w:val="single" w:sz="12" w:color="000000"/>
+              <w:left w:val="nil"/>
+              <w:right w:val="nil"/>
+            </w:tcBorders>
+          </w:tcPr>
+          <w:p>
+            <w:pPr>
+              <w:jc w:val="center"/>
+            </w:pPr>
+            <w:r>
+              <w:rPr>
+                <w:rFonts w:ascii="Times New Roman" w:hAnsi="Times New Roman" w:eastAsia="SimSun"/>
+                <w:sz w:val="18"/>
+              </w:rPr>
+            </w:r>
+            <w:r>
+              <w:rPr>
+                <w:rFonts w:ascii="Times New Roman" w:hAnsi="Times New Roman" w:eastAsia="SimSun"/>
+                <w:sz w:val="18"/>
+              </w:rPr>
+              <w:t>0.71 / ~0.44</w:t>
+            </w:r>
+          </w:p>
+        </w:tc>
+        <w:tc>
+          <w:tcPr>
+            <w:tcW w:type="dxa" w:w="3022"/>
+            <w:tcBorders>
+              <w:top w:val="nil"/>
+              <w:bottom w:val="single" w:sz="12" w:color="000000"/>
+              <w:left w:val="nil"/>
+              <w:right w:val="nil"/>
+            </w:tcBorders>
+          </w:tcPr>
+          <w:p>
+            <w:pPr>
+              <w:jc w:val="center"/>
+            </w:pPr>
+            <w:r>
+              <w:rPr>
+                <w:rFonts w:ascii="Times New Roman" w:hAnsi="Times New Roman" w:eastAsia="SimSun"/>
+                <w:sz w:val="18"/>
+              </w:rPr>
+            </w:r>
+            <w:r>
+              <w:rPr>
+                <w:rFonts w:ascii="Times New Roman" w:hAnsi="Times New Roman" w:eastAsia="SimSun"/>
+                <w:sz w:val="18"/>
+              </w:rPr>
+              <w:t>n.r.</w:t>
+            </w:r>
+          </w:p>
+        </w:tc>
+      </w:tr>
     </w:tbl>
+    <w:p>
+      <w:pPr>
+        <w:spacing w:after="120" w:line="360" w:lineRule="auto"/>
+        <w:jc w:val="both"/>
+      </w:pPr>
+      <w:r>
+        <w:rPr>
+          <w:rFonts w:ascii="Times New Roman" w:hAnsi="Times New Roman" w:eastAsia="SimSun"/>
+          <w:sz w:val="22"/>
+        </w:rPr>
+        <w:t>† Li et al. (2022) reported Pearson r = 0.71 and RMSE = 1.06 on their 10% held-out split of the same BRENDA + SABIO-RK corpus; R² is not stated in the original paper and ≈0.44 is the value cited in later work. The original trained weights are not distributed in a directly executable form and the split differs, so these values are a reference point rather than a like-for-like head-to-head. n.r., not reported in an equivalent form.</w:t>
+      </w:r>
+    </w:p>
     <w:p>
       <w:pPr>
         <w:spacing w:after="120" w:line="360" w:lineRule="auto"/>
@@ -1430,13 +1621,26 @@
     </w:p>
     <w:p>
       <w:pPr>
+        <w:spacing w:after="120" w:line="360" w:lineRule="auto"/>
+        <w:jc w:val="both"/>
+      </w:pPr>
+      <w:r>
+        <w:rPr>
+          <w:rFonts w:ascii="Times New Roman" w:hAnsi="Times New Roman" w:eastAsia="SimSun"/>
+          <w:sz w:val="22"/>
+        </w:rPr>
+        <w:t>To place CarotKcat within the DLKcat architectural family rather than only against feature-based baselines, we reimplemented the DLKcat encoder — a molecular-graph GNN for the substrate branch and an amino-acid n-gram CNN for the protein branch — and trained it on exactly the same records, splits and seeds. This from-scratch reimplementation reached r = 0.466 (random) and 0.356 (group), well below CarotKcat. The gap is diagnostic rather than incidental: with ~13,000 training records, a sequence CNN trained from scratch cannot learn a protein representation as informative as a pretrained ESM-2 encoder, which is precisely the design choice underlying CarotKcat. We stress that this is a reimplementation, not a run of the authors' released model; the original DLKcat reported r = 0.71 on its own split, and we therefore report that number as a reference (Table 1, †) instead of treating the two as directly comparable. Under the leak-free enzyme-group protocol — which the original DLKcat study did not report in an equivalent form — CarotKcat retains r = 0.44, providing the more conservative and, for enzyme-discovery use, more relevant estimate.</w:t>
+      </w:r>
+    </w:p>
+    <w:p>
+      <w:pPr>
         <w:spacing w:after="200"/>
         <w:jc w:val="center"/>
       </w:pPr>
       <w:r>
         <w:drawing>
           <wp:inline xmlns:a="http://schemas.openxmlformats.org/drawingml/2006/main" xmlns:pic="http://schemas.openxmlformats.org/drawingml/2006/picture">
-            <wp:extent cx="5580000" cy="3016447"/>
+            <wp:extent cx="5580000" cy="2689960"/>
             <wp:docPr id="3" name="Picture 3"/>
             <wp:cNvGraphicFramePr>
               <a:graphicFrameLocks noChangeAspect="1"/>
@@ -1457,7 +1661,7 @@
                   <pic:spPr>
                     <a:xfrm>
                       <a:off x="0" y="0"/>
-                      <a:ext cx="5580000" cy="3016447"/>
+                      <a:ext cx="5580000" cy="2689960"/>
                     </a:xfrm>
                     <a:prstGeom prst="rect"/>
                   </pic:spPr>
@@ -4278,7 +4482,7 @@
           <w:rFonts w:ascii="Times New Roman" w:hAnsi="Times New Roman" w:eastAsia="SimSun"/>
           <w:sz w:val="22"/>
         </w:rPr>
-        <w:t>CarotKcat delivers DLKcat-class accuracy with a lightweight, fully reproducible pipeline and, to our knowledge, the first kcat model explicitly optimised and evaluated for the carotenoid biosynthetic pathway. Three findings deserve emphasis.</w:t>
+        <w:t>CarotKcat delivers accuracy on par with DLKcat's reported performance on the same BRENDA + SABIO-RK corpus (r = 0.727 versus 0.71 under random splitting), while adding a leak-free unseen-enzyme evaluation, a carotenoid-focused case study, and a lightweight, fully reproducible pipeline. To our knowledge it is the first kcat model explicitly optimised and evaluated for the carotenoid biosynthetic pathway. Three findings deserve emphasis.</w:t>
       </w:r>
     </w:p>
     <w:p>
@@ -4291,7 +4495,7 @@
           <w:rFonts w:ascii="Times New Roman" w:hAnsi="Times New Roman" w:eastAsia="SimSun"/>
           <w:sz w:val="22"/>
         </w:rPr>
-        <w:t>First, the evaluation protocol matters. Tree-based models on frozen embeddings (UniKP/TurNuP-style) excel when test enzymes resemble training enzymes but lose up to half of their correlation under an enzyme-group split, whereas the dual-tower network's advantage appears precisely in the realistic unseen-enzyme regime — a consideration directly relevant to enzyme discovery campaigns.</w:t>
+        <w:t>First, the evaluation protocol matters. Tree-based models on frozen embeddings (UniKP/TurNuP-style) excel when test enzymes resemble training enzymes but lose up to half of their correlation under an enzyme-group split, whereas the dual-tower network's advantage appears precisely in the realistic unseen-enzyme regime — a consideration directly relevant to enzyme discovery campaigns. Consistently, a from-scratch DLKcat-style GNN+CNN reimplementation plateaued at r = 0.47 under the same split, indicating that at this data scale (~13,000 training records) pretrained protein representations, rather than architecture family alone, are the dominant driver of accuracy.</w:t>
       </w:r>
     </w:p>
     <w:p>
@@ -5370,7 +5574,7 @@
           <w:rFonts w:ascii="Times New Roman" w:hAnsi="Times New Roman" w:eastAsia="SimSun"/>
           <w:sz w:val="22"/>
         </w:rPr>
-        <w:t xml:space="preserve"> Benchmark of CarotKcat variants against UniKP- and TurNuP-style baselines and single-modality ablations under random and enzyme-group splits (test-set Pearson r). Tree-based baselines degrade sharply on unseen enzymes, whereas the dual-tower network and ensemble remain robust.</w:t>
+        <w:t xml:space="preserve"> Benchmark of CarotKcat variants against UniKP- and TurNuP-style baselines, a from-scratch reimplementation of the DLKcat GNN+CNN architecture, and single-modality ablations under random and enzyme-group splits (test-set Pearson r). Tree-based baselines degrade sharply on unseen enzymes, whereas the dual-tower network and ensemble remain robust.</w:t>
       </w:r>
     </w:p>
     <w:p>

</xml_diff>